<commit_message>
v1.4.3: fix white paper section numbering, add v1.4 rows to legacy version tables, add version stamp to quarterly checklist cover
</commit_message>
<xml_diff>
--- a/docs/SatoshiShield_Contributor_Guide_v1_4.docx
+++ b/docs/SatoshiShield_Contributor_Guide_v1_4.docx
@@ -12555,6 +12555,95 @@
                 <w:szCs w:val="20"/>
               </w:rPr>
               <w:t xml:space="preserve">Initial contributor guide. Covers finding, verifying, and submitting domains. Includes quarterly research protocol, tools reference, Git primer, and verification checklist.</w:t>
+            </w:r>
+          </w:p>
+        </w:tc>
+      </w:tr>
+      <w:tr>
+        <w:tc>
+          <w:tcPr>
+            <w:tcW w:type="dxa" w:w="1000"/>
+            <w:tcBorders>
+              <w:top w:val="single" w:color="DDDDDD" w:sz="1"/>
+              <w:left w:val="single" w:color="DDDDDD" w:sz="1"/>
+              <w:bottom w:val="single" w:color="DDDDDD" w:sz="1"/>
+              <w:right w:val="single" w:color="DDDDDD" w:sz="1"/>
+            </w:tcBorders>
+            <w:shd w:fill="FFFFFF" w:val="clear"/>
+            <w:tcMar>
+              <w:top w:type="dxa" w:w="100"/>
+              <w:left w:type="dxa" w:w="160"/>
+              <w:bottom w:type="dxa" w:w="100"/>
+              <w:right w:type="dxa" w:w="160"/>
+            </w:tcMar>
+          </w:tcPr>
+          <w:p>
+            <w:r>
+              <w:rPr>
+                <w:rFonts w:ascii="Arial" w:cs="Arial" w:eastAsia="Arial" w:hAnsi="Arial"/>
+                <w:color w:val="1A1A2E"/>
+                <w:sz w:val="20"/>
+                <w:szCs w:val="20"/>
+              </w:rPr>
+              <w:t xml:space="preserve">1.4</w:t>
+            </w:r>
+          </w:p>
+        </w:tc>
+        <w:tc>
+          <w:tcPr>
+            <w:tcW w:type="dxa" w:w="1200"/>
+            <w:tcBorders>
+              <w:top w:val="single" w:color="DDDDDD" w:sz="1"/>
+              <w:left w:val="single" w:color="DDDDDD" w:sz="1"/>
+              <w:bottom w:val="single" w:color="DDDDDD" w:sz="1"/>
+              <w:right w:val="single" w:color="DDDDDD" w:sz="1"/>
+            </w:tcBorders>
+            <w:shd w:fill="FFFFFF" w:val="clear"/>
+            <w:tcMar>
+              <w:top w:type="dxa" w:w="100"/>
+              <w:left w:type="dxa" w:w="160"/>
+              <w:bottom w:type="dxa" w:w="100"/>
+              <w:right w:type="dxa" w:w="160"/>
+            </w:tcMar>
+          </w:tcPr>
+          <w:p>
+            <w:r>
+              <w:rPr>
+                <w:rFonts w:ascii="Arial" w:cs="Arial" w:eastAsia="Arial" w:hAnsi="Arial"/>
+                <w:color w:val="1A1A2E"/>
+                <w:sz w:val="20"/>
+                <w:szCs w:val="20"/>
+              </w:rPr>
+              <w:t xml:space="preserve">May 2026</w:t>
+            </w:r>
+          </w:p>
+        </w:tc>
+        <w:tc>
+          <w:tcPr>
+            <w:tcW w:type="dxa" w:w="7160"/>
+            <w:tcBorders>
+              <w:top w:val="single" w:color="DDDDDD" w:sz="1"/>
+              <w:left w:val="single" w:color="DDDDDD" w:sz="1"/>
+              <w:bottom w:val="single" w:color="DDDDDD" w:sz="1"/>
+              <w:right w:val="single" w:color="DDDDDD" w:sz="1"/>
+            </w:tcBorders>
+            <w:shd w:fill="FFFFFF" w:val="clear"/>
+            <w:tcMar>
+              <w:top w:type="dxa" w:w="100"/>
+              <w:left w:type="dxa" w:w="160"/>
+              <w:bottom w:type="dxa" w:w="100"/>
+              <w:right w:type="dxa" w:w="160"/>
+            </w:tcMar>
+          </w:tcPr>
+          <w:p>
+            <w:r>
+              <w:rPr>
+                <w:rFonts w:ascii="Arial" w:cs="Arial" w:eastAsia="Arial" w:hAnsi="Arial"/>
+                <w:color w:val="1A1A2E"/>
+                <w:sz w:val="20"/>
+                <w:szCs w:val="20"/>
+              </w:rPr>
+              <w:t xml:space="preserve">Updated to v1.4 metadata. GitHub handle migrated from sawdustpilgrim to cypherpilgrim across all URLs. Cover, header, and footer version stamps updated.</w:t>
             </w:r>
           </w:p>
         </w:tc>

</xml_diff>

<commit_message>
Release v1.4.5: schema/category fixes, behavioral-evidence reframe, two case studies
Schema and taxonomy corrections in Contributor Guide section 5.1 (8-column CSV with tier, Surveillance Analytics added). Verification Step 4 reframed from URLScan-required to behavioral-evidence-by-method across the Guide, its PR template and Appendix B, the Quarterly Checklist, and CONTRIBUTING.md. Glassnode category aligned to data in the White Paper. Monitor Report Reading Guide cross-reference updated. Monitor script category labels aligned. Two IRS procurement case studies added to docs/ with metadata scrubbed and a named individual generalized.

See CHANGELOG.md for full details.
</commit_message>
<xml_diff>
--- a/docs/SatoshiShield_Contributor_Guide_v1_4.docx
+++ b/docs/SatoshiShield_Contributor_Guide_v1_4.docx
@@ -3852,7 +3852,7 @@
           <w:sz w:val="28"/>
           <w:szCs w:val="28"/>
         </w:rPr>
-        <w:t xml:space="preserve">4.4 Step 4 — URLScan.io Analysis</w:t>
+        <w:t xml:space="preserve">4.4 Step 4 — Behavioral Evidence</w:t>
       </w:r>
     </w:p>
     <w:p>
@@ -3868,7 +3868,7 @@
           <w:sz w:val="22"/>
           <w:szCs w:val="22"/>
         </w:rPr>
-        <w:t xml:space="preserve">URLScan.io visits a URL in a sandboxed browser and records every connection made — DNS queries, HTTP requests, JavaScript calls, and cookies. It is the single most useful tool for understanding what a domain does.</w:t>
+        <w:t xml:space="preserve">Step 4 requires behavioral evidence confirming the specific surveillance function named in the harm field. The appropriate method depends on the domain type. For domains whose surveillance behavior is not self-evident — suspected, dual-use, or camouflaged domains, typically Tier 2 — observe the behavior directly with URLScan.io. For domains operated by firms that openly document their surveillance functions, typically Tier 1, and especially for authentication-gated API endpoints that an unauthenticated sandbox visit cannot reach, the vendor's own published documentation is the appropriate evidence (see "Vendor documentation as behavioral evidence" below). URLScan.io visits a URL in a sandboxed browser and records every connection made — DNS queries, HTTP requests, JavaScript calls, and cookies. It is the most useful tool for revealing what a domain does when that behavior must be observed rather than read from the vendor.</w:t>
       </w:r>
     </w:p>
     <w:p>
@@ -4566,6 +4566,38 @@
     </w:p>
     <w:p>
       <w:pPr>
+        <w:spacing w:after="80" w:before="160"/>
+      </w:pPr>
+      <w:r>
+        <w:rPr>
+          <w:rFonts w:ascii="Arial" w:cs="Arial" w:eastAsia="Arial" w:hAnsi="Arial"/>
+          <w:b/>
+          <w:bCs/>
+          <w:color w:val="1A1A2E"/>
+          <w:sz w:val="22"/>
+          <w:szCs w:val="22"/>
+        </w:rPr>
+        <w:t xml:space="preserve">Vendor documentation as behavioral evidence</w:t>
+      </w:r>
+    </w:p>
+    <w:p>
+      <w:pPr>
+        <w:spacing w:after="80" w:before="80"/>
+      </w:pPr>
+      <w:r>
+        <w:rPr>
+          <w:rFonts w:ascii="Arial" w:cs="Arial" w:eastAsia="Arial" w:hAnsi="Arial"/>
+          <w:b w:val="false"/>
+          <w:bCs w:val="false"/>
+          <w:color w:val="1A1A2E"/>
+          <w:sz w:val="22"/>
+          <w:szCs w:val="22"/>
+        </w:rPr>
+        <w:t xml:space="preserve">When a domain is operated by a firm that openly documents its surveillance functions, the vendor’s own published API or product documentation is acceptable as Step 4 behavioral evidence in place of a URLScan.io scan. This is the appropriate method for most Tier 1 firms, and the only workable method for authentication-gated endpoints, which an unauthenticated sandbox visit cannot reach. The documentation must be published by the vendor, must explicitly confirm the specific behavior cited in the harm field — for example, logging the querying IP against the queried address, risk scoring, or attribution — and must be linked as the source. For domains that do not openly document surveillance behavior (suspected, dual-use, or camouflaged domains), vendor documentation does not suffice and a URLScan.io scan or traffic capture is required.</w:t>
+      </w:r>
+    </w:p>
+    <w:p>
+      <w:pPr>
         <w:pStyle w:val="Heading2"/>
         <w:spacing w:after="120" w:before="320"/>
       </w:pPr>
@@ -5044,7 +5076,7 @@
           <w:sz w:val="22"/>
           <w:szCs w:val="22"/>
         </w:rPr>
-        <w:t xml:space="preserve">All domain documentation is stored in domains.csv in the repository root. Each row represents one domain entry.</w:t>
+        <w:t xml:space="preserve">All domain documentation is stored in domains.csv in the repository root. Each row represents one domain entry. The category field takes one of the canonical values listed below; the inclusion criteria named in Section 2 are descriptive, and they map to these category values (for example, the “Deanonymization Platform” criterion corresponds to the Deanonymization category, and “IP-Logging Infrastructure” to IP Logging).</w:t>
       </w:r>
     </w:p>
     <w:p>
@@ -5419,7 +5451,7 @@
                 <w:sz w:val="20"/>
                 <w:szCs w:val="20"/>
               </w:rPr>
-              <w:t xml:space="preserve">One of: Blockchain Analytics, Deanonymization, Wallet Telemetry, KYC/AML Compliance, Address Screening, IP Logging</w:t>
+              <w:t xml:space="preserve">One of: Blockchain Analytics, Deanonymization, Wallet Telemetry, KYC/AML Compliance, Address Screening, IP Logging, Surveillance Analytics</w:t>
             </w:r>
           </w:p>
         </w:tc>
@@ -5449,6 +5481,95 @@
                 <w:szCs w:val="20"/>
               </w:rPr>
               <w:t xml:space="preserve">Blockchain Analytics</w:t>
+            </w:r>
+          </w:p>
+        </w:tc>
+      </w:tr>
+      <w:tr>
+        <w:tc>
+          <w:tcPr>
+            <w:tcW w:type="dxa" w:w="1600"/>
+            <w:tcBorders>
+              <w:top w:val="single" w:color="DDDDDD" w:sz="1"/>
+              <w:left w:val="single" w:color="DDDDDD" w:sz="1"/>
+              <w:bottom w:val="single" w:color="DDDDDD" w:sz="1"/>
+              <w:right w:val="single" w:color="DDDDDD" w:sz="1"/>
+            </w:tcBorders>
+            <w:shd w:fill="F5F5F5" w:val="clear"/>
+            <w:tcMar>
+              <w:top w:type="dxa" w:w="100"/>
+              <w:left w:type="dxa" w:w="160"/>
+              <w:bottom w:type="dxa" w:w="100"/>
+              <w:right w:type="dxa" w:w="160"/>
+            </w:tcMar>
+          </w:tcPr>
+          <w:p>
+            <w:r>
+              <w:rPr>
+                <w:rFonts w:ascii="Arial" w:cs="Arial" w:eastAsia="Arial" w:hAnsi="Arial"/>
+                <w:color w:val="1A1A2E"/>
+                <w:sz w:val="20"/>
+                <w:szCs w:val="20"/>
+              </w:rPr>
+              <w:t xml:space="preserve">tier</w:t>
+            </w:r>
+          </w:p>
+        </w:tc>
+        <w:tc>
+          <w:tcPr>
+            <w:tcW w:type="dxa" w:w="2200"/>
+            <w:tcBorders>
+              <w:top w:val="single" w:color="DDDDDD" w:sz="1"/>
+              <w:left w:val="single" w:color="DDDDDD" w:sz="1"/>
+              <w:bottom w:val="single" w:color="DDDDDD" w:sz="1"/>
+              <w:right w:val="single" w:color="DDDDDD" w:sz="1"/>
+            </w:tcBorders>
+            <w:shd w:fill="F5F5F5" w:val="clear"/>
+            <w:tcMar>
+              <w:top w:type="dxa" w:w="100"/>
+              <w:left w:type="dxa" w:w="160"/>
+              <w:bottom w:type="dxa" w:w="100"/>
+              <w:right w:type="dxa" w:w="160"/>
+            </w:tcMar>
+          </w:tcPr>
+          <w:p>
+            <w:r>
+              <w:rPr>
+                <w:rFonts w:ascii="Arial" w:cs="Arial" w:eastAsia="Arial" w:hAnsi="Arial"/>
+                <w:color w:val="1A1A2E"/>
+                <w:sz w:val="20"/>
+                <w:szCs w:val="20"/>
+              </w:rPr>
+              <w:t xml:space="preserve">1 for confirmed surveillance harm; 2 for entries needing further community verification</w:t>
+            </w:r>
+          </w:p>
+        </w:tc>
+        <w:tc>
+          <w:tcPr>
+            <w:tcW w:type="dxa" w:w="5560"/>
+            <w:tcBorders>
+              <w:top w:val="single" w:color="DDDDDD" w:sz="1"/>
+              <w:left w:val="single" w:color="DDDDDD" w:sz="1"/>
+              <w:bottom w:val="single" w:color="DDDDDD" w:sz="1"/>
+              <w:right w:val="single" w:color="DDDDDD" w:sz="1"/>
+            </w:tcBorders>
+            <w:shd w:fill="F5F5F5" w:val="clear"/>
+            <w:tcMar>
+              <w:top w:type="dxa" w:w="100"/>
+              <w:left w:type="dxa" w:w="160"/>
+              <w:bottom w:type="dxa" w:w="100"/>
+              <w:right w:type="dxa" w:w="160"/>
+            </w:tcMar>
+          </w:tcPr>
+          <w:p>
+            <w:r>
+              <w:rPr>
+                <w:rFonts w:ascii="Arial" w:cs="Arial" w:eastAsia="Arial" w:hAnsi="Arial"/>
+                <w:color w:val="1A1A2E"/>
+                <w:sz w:val="20"/>
+                <w:szCs w:val="20"/>
+              </w:rPr>
+              <w:t xml:space="preserve">1</w:t>
             </w:r>
           </w:p>
         </w:tc>
@@ -5877,7 +5998,7 @@
                 <w:sz w:val="20"/>
                 <w:szCs w:val="20"/>
               </w:rPr>
-              <w:t xml:space="preserve">domain,organization,category,harm,source,date_verified,notes</w:t>
+              <w:t xml:space="preserve">domain,organization,category,tier,harm,source,date_verified,notes</w:t>
             </w:r>
           </w:p>
           <w:p>
@@ -5891,7 +6012,7 @@
                 <w:sz w:val="20"/>
                 <w:szCs w:val="20"/>
               </w:rPr>
-              <w:t xml:space="preserve">*.chainalysis.com,Chainalysis Inc.,Blockchain Analytics,"Logs querying IP addresses against</w:t>
+              <w:t xml:space="preserve">*.chainalysis.com,Chainalysis Inc.,Blockchain Analytics,1,"Logs querying IP addresses against</w:t>
             </w:r>
           </w:p>
           <w:p>
@@ -7484,7 +7605,7 @@
                 <w:sz w:val="20"/>
                 <w:szCs w:val="20"/>
               </w:rPr>
-              <w:t xml:space="preserve">- [ ] URLScan.io analysis completed</w:t>
+              <w:t xml:space="preserve">- [ ] Behavioral evidence gathered — URLScan.io scan (suspected / dual-use domains) or vendor documentation (self-documented / Tier 1 firms)</w:t>
             </w:r>
           </w:p>
           <w:p>
@@ -11847,7 +11968,7 @@
                 <w:sz w:val="20"/>
                 <w:szCs w:val="20"/>
               </w:rPr>
-              <w:t xml:space="preserve">URLScan.io — analyzed domain behavior</w:t>
+              <w:t xml:space="preserve">Behavioral evidence — URLScan.io scan or vendor documentation, per domain type</w:t>
             </w:r>
           </w:p>
         </w:tc>

</xml_diff>